<commit_message>
Bulid a content Drector
added a content director that runs the pipeline
</commit_message>
<xml_diff>
--- a/GameDesignDocument/The Rebellion.docx
+++ b/GameDesignDocument/The Rebellion.docx
@@ -1446,7 +1446,7 @@
           </mc:Choice>
           <mc:Fallback>
             <w:pict>
-              <v:shapetype w14:anchorId="14160A71" id="_x0000_t32" coordsize="21600,21600" o:spt="32" o:oned="t" path="m,l21600,21600e" filled="f">
+              <v:shapetype w14:anchorId="3FA84F40" id="_x0000_t32" coordsize="21600,21600" o:spt="32" o:oned="t" path="m,l21600,21600e" filled="f">
                 <v:path arrowok="t" fillok="f" o:connecttype="none"/>
                 <o:lock v:ext="edit" shapetype="t"/>
               </v:shapetype>
@@ -1528,7 +1528,7 @@
           </mc:Choice>
           <mc:Fallback>
             <w:pict>
-              <v:shape w14:anchorId="2CAC88EF" id="Straight Arrow Connector 2" o:spid="_x0000_s1026" type="#_x0000_t32" style="position:absolute;margin-left:347.25pt;margin-top:3.5pt;width:21.75pt;height:.75pt;z-index:251670528;visibility:visible;mso-wrap-style:square;mso-wrap-distance-left:9pt;mso-wrap-distance-top:0;mso-wrap-distance-right:9pt;mso-wrap-distance-bottom:0;mso-position-horizontal:absolute;mso-position-horizontal-relative:text;mso-position-vertical:absolute;mso-position-vertical-relative:text" o:gfxdata="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" strokecolor="#156082 [3204]" strokeweight="1.5pt">
+              <v:shape w14:anchorId="74CF4EC5" id="Straight Arrow Connector 2" o:spid="_x0000_s1026" type="#_x0000_t32" style="position:absolute;margin-left:347.25pt;margin-top:3.5pt;width:21.75pt;height:.75pt;z-index:251670528;visibility:visible;mso-wrap-style:square;mso-wrap-distance-left:9pt;mso-wrap-distance-top:0;mso-wrap-distance-right:9pt;mso-wrap-distance-bottom:0;mso-position-horizontal:absolute;mso-position-horizontal-relative:text;mso-position-vertical:absolute;mso-position-vertical-relative:text" o:gfxdata="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" strokecolor="#156082 [3204]" strokeweight="1.5pt">
                 <v:stroke endarrow="block" joinstyle="miter"/>
               </v:shape>
             </w:pict>
@@ -1597,7 +1597,7 @@
           </mc:Choice>
           <mc:Fallback>
             <w:pict>
-              <v:shape w14:anchorId="2F93574D" id="Straight Arrow Connector 2" o:spid="_x0000_s1026" type="#_x0000_t32" style="position:absolute;margin-left:112.5pt;margin-top:2.6pt;width:21.75pt;height:.75pt;z-index:251666432;visibility:visible;mso-wrap-style:square;mso-wrap-distance-left:9pt;mso-wrap-distance-top:0;mso-wrap-distance-right:9pt;mso-wrap-distance-bottom:0;mso-position-horizontal:absolute;mso-position-horizontal-relative:text;mso-position-vertical:absolute;mso-position-vertical-relative:text" o:gfxdata="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" strokecolor="#156082 [3204]" strokeweight="1.5pt">
+              <v:shape w14:anchorId="3231BD43" id="Straight Arrow Connector 2" o:spid="_x0000_s1026" type="#_x0000_t32" style="position:absolute;margin-left:112.5pt;margin-top:2.6pt;width:21.75pt;height:.75pt;z-index:251666432;visibility:visible;mso-wrap-style:square;mso-wrap-distance-left:9pt;mso-wrap-distance-top:0;mso-wrap-distance-right:9pt;mso-wrap-distance-bottom:0;mso-position-horizontal:absolute;mso-position-horizontal-relative:text;mso-position-vertical:absolute;mso-position-vertical-relative:text" o:gfxdata="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" strokecolor="#156082 [3204]" strokeweight="1.5pt">
                 <v:stroke endarrow="block" joinstyle="miter"/>
               </v:shape>
             </w:pict>
@@ -1690,7 +1690,7 @@
           </mc:Choice>
           <mc:Fallback>
             <w:pict>
-              <v:shape w14:anchorId="457CCC1E" id="Straight Arrow Connector 2" o:spid="_x0000_s1026" type="#_x0000_t32" style="position:absolute;margin-left:12.75pt;margin-top:14.5pt;width:120.95pt;height:148.5pt;flip:x y;z-index:251684864;visibility:visible;mso-wrap-style:square;mso-width-percent:0;mso-height-percent:0;mso-wrap-distance-left:9pt;mso-wrap-distance-top:0;mso-wrap-distance-right:9pt;mso-wrap-distance-bottom:0;mso-position-horizontal:absolute;mso-position-horizontal-relative:text;mso-position-vertical:absolute;mso-position-vertical-relative:text;mso-width-percent:0;mso-height-percent:0;mso-width-relative:margin;mso-height-relative:margin" o:gfxdata="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" strokecolor="#156082 [3204]" strokeweight="1.5pt">
+              <v:shape w14:anchorId="1DE2DE4F" id="Straight Arrow Connector 2" o:spid="_x0000_s1026" type="#_x0000_t32" style="position:absolute;margin-left:12.75pt;margin-top:14.5pt;width:120.95pt;height:148.5pt;flip:x y;z-index:251684864;visibility:visible;mso-wrap-style:square;mso-width-percent:0;mso-height-percent:0;mso-wrap-distance-left:9pt;mso-wrap-distance-top:0;mso-wrap-distance-right:9pt;mso-wrap-distance-bottom:0;mso-position-horizontal:absolute;mso-position-horizontal-relative:text;mso-position-vertical:absolute;mso-position-vertical-relative:text;mso-width-percent:0;mso-height-percent:0;mso-width-relative:margin;mso-height-relative:margin" o:gfxdata="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" strokecolor="#156082 [3204]" strokeweight="1.5pt">
                 <v:stroke endarrow="block" joinstyle="miter"/>
               </v:shape>
             </w:pict>
@@ -1765,7 +1765,7 @@
           </mc:Choice>
           <mc:Fallback>
             <w:pict>
-              <v:shape w14:anchorId="4C8B8F30" id="Straight Arrow Connector 2" o:spid="_x0000_s1026" type="#_x0000_t32" style="position:absolute;margin-left:420pt;margin-top:6.75pt;width:3.6pt;height:47.25pt;z-index:251676672;visibility:visible;mso-wrap-style:square;mso-width-percent:0;mso-height-percent:0;mso-wrap-distance-left:9pt;mso-wrap-distance-top:0;mso-wrap-distance-right:9pt;mso-wrap-distance-bottom:0;mso-position-horizontal:absolute;mso-position-horizontal-relative:text;mso-position-vertical:absolute;mso-position-vertical-relative:text;mso-width-percent:0;mso-height-percent:0;mso-width-relative:margin;mso-height-relative:margin" o:gfxdata="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" strokecolor="#156082 [3204]" strokeweight="1.5pt">
+              <v:shape w14:anchorId="22807331" id="Straight Arrow Connector 2" o:spid="_x0000_s1026" type="#_x0000_t32" style="position:absolute;margin-left:420pt;margin-top:6.75pt;width:3.6pt;height:47.25pt;z-index:251676672;visibility:visible;mso-wrap-style:square;mso-width-percent:0;mso-height-percent:0;mso-wrap-distance-left:9pt;mso-wrap-distance-top:0;mso-wrap-distance-right:9pt;mso-wrap-distance-bottom:0;mso-position-horizontal:absolute;mso-position-horizontal-relative:text;mso-position-vertical:absolute;mso-position-vertical-relative:text;mso-width-percent:0;mso-height-percent:0;mso-width-relative:margin;mso-height-relative:margin" o:gfxdata="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" strokecolor="#156082 [3204]" strokeweight="1.5pt">
                 <v:stroke endarrow="block" joinstyle="miter"/>
               </v:shape>
             </w:pict>
@@ -1840,7 +1840,7 @@
           </mc:Choice>
           <mc:Fallback>
             <w:pict>
-              <v:shape w14:anchorId="41B77914" id="Straight Arrow Connector 2" o:spid="_x0000_s1026" type="#_x0000_t32" style="position:absolute;margin-left:294.75pt;margin-top:11.5pt;width:3.6pt;height:47.25pt;z-index:251672576;visibility:visible;mso-wrap-style:square;mso-width-percent:0;mso-height-percent:0;mso-wrap-distance-left:9pt;mso-wrap-distance-top:0;mso-wrap-distance-right:9pt;mso-wrap-distance-bottom:0;mso-position-horizontal:absolute;mso-position-horizontal-relative:text;mso-position-vertical:absolute;mso-position-vertical-relative:text;mso-width-percent:0;mso-height-percent:0;mso-width-relative:margin;mso-height-relative:margin" o:gfxdata="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" strokecolor="#156082 [3204]" strokeweight="1.5pt">
+              <v:shape w14:anchorId="4019AE6F" id="Straight Arrow Connector 2" o:spid="_x0000_s1026" type="#_x0000_t32" style="position:absolute;margin-left:294.75pt;margin-top:11.5pt;width:3.6pt;height:47.25pt;z-index:251672576;visibility:visible;mso-wrap-style:square;mso-width-percent:0;mso-height-percent:0;mso-wrap-distance-left:9pt;mso-wrap-distance-top:0;mso-wrap-distance-right:9pt;mso-wrap-distance-bottom:0;mso-position-horizontal:absolute;mso-position-horizontal-relative:text;mso-position-vertical:absolute;mso-position-vertical-relative:text;mso-width-percent:0;mso-height-percent:0;mso-width-relative:margin;mso-height-relative:margin" o:gfxdata="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" strokecolor="#156082 [3204]" strokeweight="1.5pt">
                 <v:stroke endarrow="block" joinstyle="miter"/>
               </v:shape>
             </w:pict>
@@ -5313,7 +5313,15 @@
           <w:sz w:val="32"/>
           <w:szCs w:val="32"/>
         </w:rPr>
-        <w:t xml:space="preserve">Theme </w:t>
+        <w:t>Theme</w:t>
+      </w:r>
+      <w:r>
+        <w:rPr>
+          <w:rFonts w:ascii="Arial" w:hAnsi="Arial" w:cs="Arial"/>
+          <w:sz w:val="32"/>
+          <w:szCs w:val="32"/>
+        </w:rPr>
+        <w:t xml:space="preserve"> of the game </w:t>
       </w:r>
     </w:p>
     <w:p>
@@ -5487,6 +5495,49 @@
       <w:pPr>
         <w:rPr>
           <w:rFonts w:ascii="Arial" w:hAnsi="Arial" w:cs="Arial"/>
+          <w:sz w:val="32"/>
+          <w:szCs w:val="32"/>
+        </w:rPr>
+      </w:pPr>
+    </w:p>
+    <w:p>
+      <w:pPr>
+        <w:rPr>
+          <w:rFonts w:ascii="Arial" w:hAnsi="Arial" w:cs="Arial"/>
+          <w:sz w:val="32"/>
+          <w:szCs w:val="32"/>
+        </w:rPr>
+      </w:pPr>
+      <w:r>
+        <w:rPr>
+          <w:rFonts w:ascii="Arial" w:hAnsi="Arial" w:cs="Arial"/>
+          <w:sz w:val="32"/>
+          <w:szCs w:val="32"/>
+        </w:rPr>
+        <w:t>Char</w:t>
+      </w:r>
+      <w:r>
+        <w:rPr>
+          <w:rFonts w:ascii="Arial" w:hAnsi="Arial" w:cs="Arial"/>
+          <w:sz w:val="32"/>
+          <w:szCs w:val="32"/>
+        </w:rPr>
+        <w:t xml:space="preserve">acter – the hero </w:t>
+      </w:r>
+    </w:p>
+    <w:p>
+      <w:pPr>
+        <w:rPr>
+          <w:rFonts w:ascii="Arial" w:hAnsi="Arial" w:cs="Arial"/>
+          <w:sz w:val="32"/>
+          <w:szCs w:val="32"/>
+        </w:rPr>
+      </w:pPr>
+    </w:p>
+    <w:p>
+      <w:pPr>
+        <w:rPr>
+          <w:rFonts w:ascii="Arial" w:hAnsi="Arial" w:cs="Arial"/>
           <w:b/>
           <w:bCs/>
           <w:sz w:val="32"/>
@@ -5599,16 +5650,8 @@
           <w:sz w:val="32"/>
           <w:szCs w:val="32"/>
         </w:rPr>
-        <w:t xml:space="preserve">His mother ran a tiny food stall near the community garden, serving hot bowls of stew to anyone who needed a meal. His father, a muralist, painted the faces of local heroes across the district walls — cooks, musicians, activists, teachers — </w:t>
-      </w:r>
-      <w:r>
-        <w:rPr>
-          <w:rFonts w:ascii="Arial" w:hAnsi="Arial" w:cs="Arial"/>
-          <w:sz w:val="32"/>
-          <w:szCs w:val="32"/>
-        </w:rPr>
         <w:lastRenderedPageBreak/>
-        <w:t>everyday people who kept Fallen City standing. Zed grew up believing that strength wasn’t about power; it was about protecting the people who gave your life meaning.</w:t>
+        <w:t>His mother ran a tiny food stall near the community garden, serving hot bowls of stew to anyone who needed a meal. His father, a muralist, painted the faces of local heroes across the district walls — cooks, musicians, activists, teachers — everyday people who kept Fallen City standing. Zed grew up believing that strength wasn’t about power; it was about protecting the people who gave your life meaning.</w:t>
       </w:r>
     </w:p>
     <w:p>
@@ -5656,7 +5699,17 @@
           <w:sz w:val="32"/>
           <w:szCs w:val="32"/>
         </w:rPr>
-        <w:t>RUSH</w:t>
+        <w:t>RU</w:t>
+      </w:r>
+      <w:r>
+        <w:rPr>
+          <w:rFonts w:ascii="Arial" w:hAnsi="Arial" w:cs="Arial"/>
+          <w:b/>
+          <w:bCs/>
+          <w:sz w:val="32"/>
+          <w:szCs w:val="32"/>
+        </w:rPr>
+        <w:t>ST</w:t>
       </w:r>
       <w:r>
         <w:rPr>
@@ -5860,6 +5913,7 @@
           <w:sz w:val="32"/>
           <w:szCs w:val="32"/>
         </w:rPr>
+        <w:lastRenderedPageBreak/>
         <w:t>Skill depth through combos and defence</w:t>
       </w:r>
       <w:r>
@@ -5891,7 +5945,6 @@
           <w:sz w:val="32"/>
           <w:szCs w:val="32"/>
         </w:rPr>
-        <w:lastRenderedPageBreak/>
         <w:t>Wave-clearing under pressure</w:t>
       </w:r>
       <w:r>

</xml_diff>

<commit_message>
Added the hit and stop
added the hit and stop feature
</commit_message>
<xml_diff>
--- a/GameDesignDocument/The Rebellion.docx
+++ b/GameDesignDocument/The Rebellion.docx
@@ -5608,17 +5608,43 @@
       <w:pPr>
         <w:rPr>
           <w:rFonts w:ascii="Arial" w:hAnsi="Arial" w:cs="Arial"/>
-          <w:sz w:val="32"/>
-          <w:szCs w:val="32"/>
-        </w:rPr>
-      </w:pPr>
-      <w:r>
-        <w:rPr>
-          <w:rFonts w:ascii="Arial" w:hAnsi="Arial" w:cs="Arial"/>
-          <w:sz w:val="32"/>
-          <w:szCs w:val="32"/>
+          <w:sz w:val="36"/>
+          <w:szCs w:val="36"/>
+        </w:rPr>
+      </w:pPr>
+      <w:r>
+        <w:rPr>
+          <w:rFonts w:ascii="Arial" w:hAnsi="Arial" w:cs="Arial"/>
+          <w:sz w:val="36"/>
+          <w:szCs w:val="36"/>
         </w:rPr>
         <w:lastRenderedPageBreak/>
+        <w:t xml:space="preserve">The Story </w:t>
+      </w:r>
+    </w:p>
+    <w:p>
+      <w:pPr>
+        <w:rPr>
+          <w:rFonts w:ascii="Arial" w:hAnsi="Arial" w:cs="Arial"/>
+          <w:sz w:val="32"/>
+          <w:szCs w:val="32"/>
+        </w:rPr>
+      </w:pPr>
+    </w:p>
+    <w:p>
+      <w:pPr>
+        <w:rPr>
+          <w:rFonts w:ascii="Arial" w:hAnsi="Arial" w:cs="Arial"/>
+          <w:sz w:val="32"/>
+          <w:szCs w:val="32"/>
+        </w:rPr>
+      </w:pPr>
+      <w:r>
+        <w:rPr>
+          <w:rFonts w:ascii="Arial" w:hAnsi="Arial" w:cs="Arial"/>
+          <w:sz w:val="32"/>
+          <w:szCs w:val="32"/>
+        </w:rPr>
         <w:t>Char</w:t>
       </w:r>
       <w:r>
@@ -5857,6 +5883,83 @@
           <w:szCs w:val="32"/>
         </w:rPr>
       </w:pPr>
+    </w:p>
+    <w:p>
+      <w:pPr>
+        <w:rPr>
+          <w:rFonts w:ascii="Arial" w:hAnsi="Arial" w:cs="Arial"/>
+          <w:b/>
+          <w:bCs/>
+          <w:sz w:val="32"/>
+          <w:szCs w:val="32"/>
+        </w:rPr>
+      </w:pPr>
+    </w:p>
+    <w:p>
+      <w:pPr>
+        <w:rPr>
+          <w:rFonts w:ascii="Arial" w:hAnsi="Arial" w:cs="Arial"/>
+          <w:b/>
+          <w:bCs/>
+          <w:sz w:val="32"/>
+          <w:szCs w:val="32"/>
+        </w:rPr>
+      </w:pPr>
+    </w:p>
+    <w:p>
+      <w:pPr>
+        <w:rPr>
+          <w:rFonts w:ascii="Arial" w:hAnsi="Arial" w:cs="Arial"/>
+          <w:b/>
+          <w:bCs/>
+          <w:sz w:val="32"/>
+          <w:szCs w:val="32"/>
+        </w:rPr>
+      </w:pPr>
+    </w:p>
+    <w:p>
+      <w:pPr>
+        <w:rPr>
+          <w:rFonts w:ascii="Arial" w:hAnsi="Arial" w:cs="Arial"/>
+          <w:b/>
+          <w:bCs/>
+          <w:sz w:val="32"/>
+          <w:szCs w:val="32"/>
+        </w:rPr>
+      </w:pPr>
+    </w:p>
+    <w:p>
+      <w:pPr>
+        <w:rPr>
+          <w:rFonts w:ascii="Arial" w:hAnsi="Arial" w:cs="Arial"/>
+          <w:b/>
+          <w:bCs/>
+          <w:sz w:val="32"/>
+          <w:szCs w:val="32"/>
+        </w:rPr>
+      </w:pPr>
+    </w:p>
+    <w:p>
+      <w:pPr>
+        <w:rPr>
+          <w:rFonts w:ascii="Arial" w:hAnsi="Arial" w:cs="Arial"/>
+          <w:b/>
+          <w:bCs/>
+          <w:sz w:val="32"/>
+          <w:szCs w:val="32"/>
+        </w:rPr>
+      </w:pPr>
+    </w:p>
+    <w:p>
+      <w:pPr>
+        <w:rPr>
+          <w:rFonts w:ascii="Arial" w:hAnsi="Arial" w:cs="Arial"/>
+          <w:b/>
+          <w:bCs/>
+          <w:sz w:val="32"/>
+          <w:szCs w:val="32"/>
+        </w:rPr>
+      </w:pPr>
       <w:r>
         <w:rPr>
           <w:rFonts w:ascii="Arial" w:hAnsi="Arial" w:cs="Arial"/>
@@ -5867,6 +5970,17 @@
         </w:rPr>
         <w:t>The Fall of Fallen City</w:t>
       </w:r>
+    </w:p>
+    <w:p>
+      <w:pPr>
+        <w:rPr>
+          <w:rFonts w:ascii="Arial" w:hAnsi="Arial" w:cs="Arial"/>
+          <w:b/>
+          <w:bCs/>
+          <w:sz w:val="32"/>
+          <w:szCs w:val="32"/>
+        </w:rPr>
+      </w:pPr>
     </w:p>
     <w:p>
       <w:pPr>
@@ -5981,16 +6095,7 @@
           <w:sz w:val="32"/>
           <w:szCs w:val="32"/>
         </w:rPr>
-        <w:t xml:space="preserve"> didn’t arrive like soldiers; they arrived like thieves. They shut down the basketball courts. They fenced off the community gardens. They patrolled the alleys where kids used to play. </w:t>
-      </w:r>
-      <w:r>
-        <w:rPr>
-          <w:rFonts w:ascii="Arial" w:hAnsi="Arial" w:cs="Arial"/>
-          <w:sz w:val="32"/>
-          <w:szCs w:val="32"/>
-        </w:rPr>
-        <w:lastRenderedPageBreak/>
-        <w:t>They tore down murals — including his father’s — replacing them with surveillance towers and propaganda screens.</w:t>
+        <w:t xml:space="preserve"> didn’t arrive like soldiers; they arrived like thieves. They shut down the basketball courts. They fenced off the community gardens. They patrolled the alleys where kids used to play. They tore down murals — including his father’s — replacing them with surveillance towers and propaganda screens.</w:t>
       </w:r>
     </w:p>
     <w:p>
@@ -6198,6 +6303,7 @@
           <w:sz w:val="32"/>
           <w:szCs w:val="32"/>
         </w:rPr>
+        <w:lastRenderedPageBreak/>
         <w:t>Wave-clearing under pressure</w:t>
       </w:r>
       <w:r>
@@ -6288,7 +6394,6 @@
           <w:sz w:val="32"/>
           <w:szCs w:val="32"/>
         </w:rPr>
-        <w:lastRenderedPageBreak/>
         <w:t>Every wave he clears, every arena he survives, every enemy he knocks down brings him closer to finding out what happened to his father — and to restoring the community that raised him.</w:t>
       </w:r>
     </w:p>
@@ -6427,42 +6532,575 @@
           <w:szCs w:val="32"/>
         </w:rPr>
       </w:pPr>
-    </w:p>
-    <w:p>
-      <w:pPr>
-        <w:rPr>
-          <w:rFonts w:ascii="Arial" w:hAnsi="Arial" w:cs="Arial"/>
-          <w:sz w:val="32"/>
-          <w:szCs w:val="32"/>
-        </w:rPr>
-      </w:pPr>
-    </w:p>
-    <w:p>
-      <w:pPr>
-        <w:rPr>
-          <w:rFonts w:ascii="Arial" w:hAnsi="Arial" w:cs="Arial"/>
-          <w:sz w:val="32"/>
-          <w:szCs w:val="32"/>
-        </w:rPr>
-      </w:pPr>
-    </w:p>
-    <w:p>
-      <w:pPr>
-        <w:rPr>
-          <w:rFonts w:ascii="Arial" w:hAnsi="Arial" w:cs="Arial"/>
-          <w:sz w:val="32"/>
-          <w:szCs w:val="32"/>
-        </w:rPr>
-      </w:pPr>
-    </w:p>
-    <w:p>
-      <w:pPr>
-        <w:rPr>
-          <w:rFonts w:ascii="Arial" w:hAnsi="Arial" w:cs="Arial"/>
-          <w:sz w:val="32"/>
-          <w:szCs w:val="32"/>
-        </w:rPr>
-      </w:pPr>
+      <w:r>
+        <w:rPr>
+          <w:rFonts w:ascii="Arial" w:hAnsi="Arial" w:cs="Arial"/>
+          <w:sz w:val="32"/>
+          <w:szCs w:val="32"/>
+        </w:rPr>
+        <w:lastRenderedPageBreak/>
+        <w:t xml:space="preserve">Character – the </w:t>
+      </w:r>
+      <w:r>
+        <w:rPr>
+          <w:rFonts w:ascii="Arial" w:hAnsi="Arial" w:cs="Arial"/>
+          <w:sz w:val="32"/>
+          <w:szCs w:val="32"/>
+        </w:rPr>
+        <w:t xml:space="preserve">Enemy </w:t>
+      </w:r>
+    </w:p>
+    <w:p>
+      <w:pPr>
+        <w:rPr>
+          <w:rFonts w:ascii="Arial" w:hAnsi="Arial" w:cs="Arial"/>
+          <w:sz w:val="32"/>
+          <w:szCs w:val="32"/>
+        </w:rPr>
+      </w:pPr>
+      <w:r>
+        <w:rPr>
+          <w:rFonts w:ascii="Arial" w:hAnsi="Arial" w:cs="Arial"/>
+          <w:sz w:val="32"/>
+          <w:szCs w:val="32"/>
+        </w:rPr>
+        <w:t xml:space="preserve"> </w:t>
+      </w:r>
+    </w:p>
+    <w:p>
+      <w:pPr>
+        <w:rPr>
+          <w:rFonts w:ascii="Arial" w:hAnsi="Arial" w:cs="Arial"/>
+          <w:sz w:val="32"/>
+          <w:szCs w:val="32"/>
+        </w:rPr>
+      </w:pPr>
+      <w:r>
+        <w:rPr>
+          <w:rFonts w:ascii="Arial" w:hAnsi="Arial" w:cs="Arial"/>
+          <w:sz w:val="32"/>
+          <w:szCs w:val="32"/>
+        </w:rPr>
+        <w:t>Enemy Faction Lore: RUST — The Private Security Force of Fallen City</w:t>
+      </w:r>
+      <w:r>
+        <w:rPr>
+          <w:rFonts w:ascii="Arial" w:hAnsi="Arial" w:cs="Arial"/>
+          <w:sz w:val="32"/>
+          <w:szCs w:val="32"/>
+        </w:rPr>
+        <w:t xml:space="preserve"> </w:t>
+      </w:r>
+    </w:p>
+    <w:p>
+      <w:pPr>
+        <w:rPr>
+          <w:rFonts w:ascii="Arial" w:hAnsi="Arial" w:cs="Arial"/>
+          <w:sz w:val="32"/>
+          <w:szCs w:val="32"/>
+        </w:rPr>
+      </w:pPr>
+    </w:p>
+    <w:p>
+      <w:pPr>
+        <w:rPr>
+          <w:rFonts w:ascii="Arial" w:hAnsi="Arial" w:cs="Arial"/>
+          <w:b/>
+          <w:bCs/>
+          <w:sz w:val="32"/>
+          <w:szCs w:val="32"/>
+        </w:rPr>
+      </w:pPr>
+      <w:r>
+        <w:rPr>
+          <w:rFonts w:ascii="Arial" w:hAnsi="Arial" w:cs="Arial"/>
+          <w:b/>
+          <w:bCs/>
+          <w:sz w:val="32"/>
+          <w:szCs w:val="32"/>
+        </w:rPr>
+        <w:t>Over</w:t>
+      </w:r>
+      <w:r>
+        <w:rPr>
+          <w:rFonts w:ascii="Arial" w:hAnsi="Arial" w:cs="Arial"/>
+          <w:b/>
+          <w:bCs/>
+          <w:sz w:val="32"/>
+          <w:szCs w:val="32"/>
+        </w:rPr>
+        <w:t>view</w:t>
+      </w:r>
+    </w:p>
+    <w:p>
+      <w:pPr>
+        <w:rPr>
+          <w:rFonts w:ascii="Arial" w:hAnsi="Arial" w:cs="Arial"/>
+          <w:sz w:val="32"/>
+          <w:szCs w:val="32"/>
+        </w:rPr>
+      </w:pPr>
+    </w:p>
+    <w:p>
+      <w:pPr>
+        <w:rPr>
+          <w:rFonts w:ascii="Arial" w:hAnsi="Arial" w:cs="Arial"/>
+        </w:rPr>
+      </w:pPr>
+      <w:r>
+        <w:rPr>
+          <w:rFonts w:ascii="Arial" w:hAnsi="Arial" w:cs="Arial"/>
+          <w:b/>
+          <w:bCs/>
+          <w:sz w:val="32"/>
+          <w:szCs w:val="32"/>
+        </w:rPr>
+        <w:t>Rust</w:t>
+      </w:r>
+      <w:r>
+        <w:rPr>
+          <w:rFonts w:ascii="Arial" w:hAnsi="Arial" w:cs="Arial"/>
+          <w:sz w:val="32"/>
+          <w:szCs w:val="32"/>
+        </w:rPr>
+        <w:t xml:space="preserve"> </w:t>
+      </w:r>
+      <w:r>
+        <w:rPr>
+          <w:rFonts w:ascii="Arial" w:hAnsi="Arial" w:cs="Arial"/>
+        </w:rPr>
+        <w:t>began as a private security contractor hired to “stabilize” Fallen City after years of political decay and rising crime. But once they were inside, they never left. Rust transformed from a protective force into a militarized occupation, tightening control over every district and crushing resistance with brutal efficiency.</w:t>
+      </w:r>
+    </w:p>
+    <w:p>
+      <w:pPr>
+        <w:rPr>
+          <w:rFonts w:ascii="Arial" w:hAnsi="Arial" w:cs="Arial"/>
+        </w:rPr>
+      </w:pPr>
+      <w:r>
+        <w:rPr>
+          <w:rFonts w:ascii="Arial" w:hAnsi="Arial" w:cs="Arial"/>
+        </w:rPr>
+        <w:t xml:space="preserve">Their name comes from their signature </w:t>
+      </w:r>
+      <w:r>
+        <w:rPr>
+          <w:rFonts w:ascii="Arial" w:hAnsi="Arial" w:cs="Arial"/>
+          <w:b/>
+          <w:bCs/>
+        </w:rPr>
+        <w:t xml:space="preserve">oxidized metal </w:t>
+      </w:r>
+      <w:proofErr w:type="spellStart"/>
+      <w:r>
+        <w:rPr>
+          <w:rFonts w:ascii="Arial" w:hAnsi="Arial" w:cs="Arial"/>
+          <w:b/>
+          <w:bCs/>
+        </w:rPr>
+        <w:t>armor</w:t>
+      </w:r>
+      <w:proofErr w:type="spellEnd"/>
+      <w:r>
+        <w:rPr>
+          <w:rFonts w:ascii="Arial" w:hAnsi="Arial" w:cs="Arial"/>
+        </w:rPr>
+        <w:t>, a symbol of decay — a reminder that Fallen City is rotting under their rule.</w:t>
+      </w:r>
+    </w:p>
+    <w:p>
+      <w:pPr>
+        <w:rPr>
+          <w:rFonts w:ascii="Arial" w:hAnsi="Arial" w:cs="Arial"/>
+        </w:rPr>
+      </w:pPr>
+      <w:r>
+        <w:rPr>
+          <w:rFonts w:ascii="Arial" w:hAnsi="Arial" w:cs="Arial"/>
+        </w:rPr>
+        <w:t>Rust’s soldiers are not just guards. They are enforcers, hunters, and executioners. Each unit is trained to suppress civilians, eliminate rebels, and maintain absolute control.</w:t>
+      </w:r>
+    </w:p>
+    <w:p>
+      <w:pPr>
+        <w:rPr>
+          <w:rFonts w:ascii="Arial" w:hAnsi="Arial" w:cs="Arial"/>
+          <w:sz w:val="32"/>
+          <w:szCs w:val="32"/>
+        </w:rPr>
+      </w:pPr>
+    </w:p>
+    <w:p>
+      <w:pPr>
+        <w:rPr>
+          <w:rFonts w:ascii="Arial" w:hAnsi="Arial" w:cs="Arial"/>
+          <w:sz w:val="32"/>
+          <w:szCs w:val="32"/>
+        </w:rPr>
+      </w:pPr>
+    </w:p>
+    <w:p>
+      <w:pPr>
+        <w:rPr>
+          <w:rFonts w:ascii="Arial" w:hAnsi="Arial" w:cs="Arial"/>
+          <w:sz w:val="32"/>
+          <w:szCs w:val="32"/>
+        </w:rPr>
+      </w:pPr>
+    </w:p>
+    <w:p>
+      <w:pPr>
+        <w:rPr>
+          <w:rFonts w:ascii="Arial" w:hAnsi="Arial" w:cs="Arial"/>
+          <w:sz w:val="32"/>
+          <w:szCs w:val="32"/>
+        </w:rPr>
+      </w:pPr>
+    </w:p>
+    <w:p>
+      <w:pPr>
+        <w:rPr>
+          <w:rFonts w:ascii="Segoe UI Emoji" w:hAnsi="Segoe UI Emoji" w:cs="Segoe UI Emoji"/>
+          <w:b/>
+          <w:bCs/>
+          <w:sz w:val="32"/>
+          <w:szCs w:val="32"/>
+        </w:rPr>
+      </w:pPr>
+    </w:p>
+    <w:p>
+      <w:pPr>
+        <w:rPr>
+          <w:rFonts w:ascii="Segoe UI Emoji" w:hAnsi="Segoe UI Emoji" w:cs="Segoe UI Emoji"/>
+          <w:b/>
+          <w:bCs/>
+          <w:sz w:val="32"/>
+          <w:szCs w:val="32"/>
+        </w:rPr>
+      </w:pPr>
+    </w:p>
+    <w:p>
+      <w:pPr>
+        <w:rPr>
+          <w:rFonts w:ascii="Segoe UI Emoji" w:hAnsi="Segoe UI Emoji" w:cs="Segoe UI Emoji"/>
+          <w:b/>
+          <w:bCs/>
+          <w:sz w:val="32"/>
+          <w:szCs w:val="32"/>
+        </w:rPr>
+      </w:pPr>
+    </w:p>
+    <w:p>
+      <w:pPr>
+        <w:rPr>
+          <w:rFonts w:ascii="Segoe UI Emoji" w:hAnsi="Segoe UI Emoji" w:cs="Segoe UI Emoji"/>
+          <w:b/>
+          <w:bCs/>
+          <w:sz w:val="32"/>
+          <w:szCs w:val="32"/>
+        </w:rPr>
+      </w:pPr>
+    </w:p>
+    <w:p>
+      <w:pPr>
+        <w:rPr>
+          <w:rFonts w:ascii="Segoe UI Emoji" w:hAnsi="Segoe UI Emoji" w:cs="Segoe UI Emoji"/>
+          <w:b/>
+          <w:bCs/>
+          <w:sz w:val="32"/>
+          <w:szCs w:val="32"/>
+        </w:rPr>
+      </w:pPr>
+    </w:p>
+    <w:p>
+      <w:pPr>
+        <w:rPr>
+          <w:rFonts w:ascii="Segoe UI Emoji" w:hAnsi="Segoe UI Emoji" w:cs="Segoe UI Emoji"/>
+          <w:b/>
+          <w:bCs/>
+          <w:sz w:val="32"/>
+          <w:szCs w:val="32"/>
+        </w:rPr>
+      </w:pPr>
+    </w:p>
+    <w:p>
+      <w:pPr>
+        <w:rPr>
+          <w:rFonts w:ascii="Arial" w:hAnsi="Arial" w:cs="Arial"/>
+          <w:b/>
+          <w:bCs/>
+          <w:sz w:val="32"/>
+          <w:szCs w:val="32"/>
+        </w:rPr>
+      </w:pPr>
+      <w:r>
+        <w:rPr>
+          <w:rFonts w:ascii="Segoe UI Emoji" w:hAnsi="Segoe UI Emoji" w:cs="Segoe UI Emoji"/>
+          <w:b/>
+          <w:bCs/>
+          <w:sz w:val="32"/>
+          <w:szCs w:val="32"/>
+        </w:rPr>
+        <w:lastRenderedPageBreak/>
+        <w:t>⚙️</w:t>
+      </w:r>
+      <w:r>
+        <w:rPr>
+          <w:rFonts w:ascii="Arial" w:hAnsi="Arial" w:cs="Arial"/>
+          <w:b/>
+          <w:bCs/>
+          <w:sz w:val="32"/>
+          <w:szCs w:val="32"/>
+        </w:rPr>
+        <w:t xml:space="preserve"> Rust’s Origin</w:t>
+      </w:r>
+    </w:p>
+    <w:p>
+      <w:pPr>
+        <w:rPr>
+          <w:rFonts w:ascii="Arial" w:hAnsi="Arial" w:cs="Arial"/>
+          <w:sz w:val="32"/>
+          <w:szCs w:val="32"/>
+        </w:rPr>
+      </w:pPr>
+      <w:r>
+        <w:rPr>
+          <w:rFonts w:ascii="Arial" w:hAnsi="Arial" w:cs="Arial"/>
+          <w:sz w:val="32"/>
+          <w:szCs w:val="32"/>
+        </w:rPr>
+        <w:t xml:space="preserve">Rust was founded by </w:t>
+      </w:r>
+      <w:r>
+        <w:rPr>
+          <w:rFonts w:ascii="Arial" w:hAnsi="Arial" w:cs="Arial"/>
+          <w:b/>
+          <w:bCs/>
+          <w:sz w:val="32"/>
+          <w:szCs w:val="32"/>
+        </w:rPr>
+        <w:t>Commander Halden Varr</w:t>
+      </w:r>
+      <w:r>
+        <w:rPr>
+          <w:rFonts w:ascii="Arial" w:hAnsi="Arial" w:cs="Arial"/>
+          <w:sz w:val="32"/>
+          <w:szCs w:val="32"/>
+        </w:rPr>
+        <w:t>, a former military strategist who believed order could only be achieved through fear. When Fallen City’s government collapsed, Varr seized the opportunity. He offered “protection” to the remaining officials, then quietly replaced them with Rust loyalists.</w:t>
+      </w:r>
+    </w:p>
+    <w:p>
+      <w:pPr>
+        <w:rPr>
+          <w:rFonts w:ascii="Arial" w:hAnsi="Arial" w:cs="Arial"/>
+          <w:sz w:val="32"/>
+          <w:szCs w:val="32"/>
+        </w:rPr>
+      </w:pPr>
+      <w:r>
+        <w:rPr>
+          <w:rFonts w:ascii="Arial" w:hAnsi="Arial" w:cs="Arial"/>
+          <w:sz w:val="32"/>
+          <w:szCs w:val="32"/>
+        </w:rPr>
+        <w:t>Within months:</w:t>
+      </w:r>
+    </w:p>
+    <w:p>
+      <w:pPr>
+        <w:numPr>
+          <w:ilvl w:val="0"/>
+          <w:numId w:val="5"/>
+        </w:numPr>
+        <w:rPr>
+          <w:rFonts w:ascii="Arial" w:hAnsi="Arial" w:cs="Arial"/>
+          <w:sz w:val="32"/>
+          <w:szCs w:val="32"/>
+        </w:rPr>
+      </w:pPr>
+      <w:r>
+        <w:rPr>
+          <w:rFonts w:ascii="Arial" w:hAnsi="Arial" w:cs="Arial"/>
+          <w:sz w:val="32"/>
+          <w:szCs w:val="32"/>
+        </w:rPr>
+        <w:t>Curfews became mandatory</w:t>
+      </w:r>
+    </w:p>
+    <w:p>
+      <w:pPr>
+        <w:numPr>
+          <w:ilvl w:val="0"/>
+          <w:numId w:val="5"/>
+        </w:numPr>
+        <w:rPr>
+          <w:rFonts w:ascii="Arial" w:hAnsi="Arial" w:cs="Arial"/>
+          <w:sz w:val="32"/>
+          <w:szCs w:val="32"/>
+        </w:rPr>
+      </w:pPr>
+      <w:r>
+        <w:rPr>
+          <w:rFonts w:ascii="Arial" w:hAnsi="Arial" w:cs="Arial"/>
+          <w:sz w:val="32"/>
+          <w:szCs w:val="32"/>
+        </w:rPr>
+        <w:t>Districts were sealed</w:t>
+      </w:r>
+    </w:p>
+    <w:p>
+      <w:pPr>
+        <w:numPr>
+          <w:ilvl w:val="0"/>
+          <w:numId w:val="5"/>
+        </w:numPr>
+        <w:rPr>
+          <w:rFonts w:ascii="Arial" w:hAnsi="Arial" w:cs="Arial"/>
+          <w:sz w:val="32"/>
+          <w:szCs w:val="32"/>
+        </w:rPr>
+      </w:pPr>
+      <w:r>
+        <w:rPr>
+          <w:rFonts w:ascii="Arial" w:hAnsi="Arial" w:cs="Arial"/>
+          <w:sz w:val="32"/>
+          <w:szCs w:val="32"/>
+        </w:rPr>
+        <w:t>Surveillance drones filled the sky</w:t>
+      </w:r>
+    </w:p>
+    <w:p>
+      <w:pPr>
+        <w:numPr>
+          <w:ilvl w:val="0"/>
+          <w:numId w:val="5"/>
+        </w:numPr>
+        <w:rPr>
+          <w:rFonts w:ascii="Arial" w:hAnsi="Arial" w:cs="Arial"/>
+          <w:sz w:val="32"/>
+          <w:szCs w:val="32"/>
+        </w:rPr>
+      </w:pPr>
+      <w:r>
+        <w:rPr>
+          <w:rFonts w:ascii="Arial" w:hAnsi="Arial" w:cs="Arial"/>
+          <w:sz w:val="32"/>
+          <w:szCs w:val="32"/>
+        </w:rPr>
+        <w:t>Anyone who resisted disappeared</w:t>
+      </w:r>
+    </w:p>
+    <w:p>
+      <w:pPr>
+        <w:rPr>
+          <w:rFonts w:ascii="Arial" w:hAnsi="Arial" w:cs="Arial"/>
+          <w:sz w:val="32"/>
+          <w:szCs w:val="32"/>
+        </w:rPr>
+      </w:pPr>
+      <w:r>
+        <w:rPr>
+          <w:rFonts w:ascii="Arial" w:hAnsi="Arial" w:cs="Arial"/>
+          <w:sz w:val="32"/>
+          <w:szCs w:val="32"/>
+        </w:rPr>
+        <w:t>Rust became the law. Rust became the city.</w:t>
+      </w:r>
+    </w:p>
+    <w:p>
+      <w:pPr>
+        <w:rPr>
+          <w:rFonts w:ascii="Arial" w:hAnsi="Arial" w:cs="Arial"/>
+          <w:sz w:val="32"/>
+          <w:szCs w:val="32"/>
+        </w:rPr>
+      </w:pPr>
+    </w:p>
+    <w:p>
+      <w:pPr>
+        <w:rPr>
+          <w:rFonts w:ascii="Arial" w:hAnsi="Arial" w:cs="Arial"/>
+          <w:b/>
+          <w:bCs/>
+          <w:sz w:val="32"/>
+          <w:szCs w:val="32"/>
+        </w:rPr>
+      </w:pPr>
+      <w:r>
+        <w:rPr>
+          <w:rFonts w:ascii="Segoe UI Emoji" w:hAnsi="Segoe UI Emoji" w:cs="Segoe UI Emoji"/>
+          <w:b/>
+          <w:bCs/>
+          <w:sz w:val="32"/>
+          <w:szCs w:val="32"/>
+        </w:rPr>
+        <w:t>🔩</w:t>
+      </w:r>
+      <w:r>
+        <w:rPr>
+          <w:rFonts w:ascii="Arial" w:hAnsi="Arial" w:cs="Arial"/>
+          <w:b/>
+          <w:bCs/>
+          <w:sz w:val="32"/>
+          <w:szCs w:val="32"/>
+        </w:rPr>
+        <w:t xml:space="preserve"> Rust’s Philosophy</w:t>
+      </w:r>
+    </w:p>
+    <w:p>
+      <w:pPr>
+        <w:rPr>
+          <w:rFonts w:ascii="Arial" w:hAnsi="Arial" w:cs="Arial"/>
+          <w:sz w:val="32"/>
+          <w:szCs w:val="32"/>
+        </w:rPr>
+      </w:pPr>
+      <w:r>
+        <w:rPr>
+          <w:rFonts w:ascii="Arial" w:hAnsi="Arial" w:cs="Arial"/>
+          <w:sz w:val="32"/>
+          <w:szCs w:val="32"/>
+        </w:rPr>
+        <w:t>Rust operates under a single doctrine:</w:t>
+      </w:r>
+    </w:p>
+    <w:p>
+      <w:pPr>
+        <w:rPr>
+          <w:rFonts w:ascii="Arial" w:hAnsi="Arial" w:cs="Arial"/>
+          <w:sz w:val="32"/>
+          <w:szCs w:val="32"/>
+        </w:rPr>
+      </w:pPr>
+      <w:r>
+        <w:rPr>
+          <w:rFonts w:ascii="Arial" w:hAnsi="Arial" w:cs="Arial"/>
+          <w:b/>
+          <w:bCs/>
+          <w:sz w:val="32"/>
+          <w:szCs w:val="32"/>
+        </w:rPr>
+        <w:t>“Order is strength. Freedom is weakness.”</w:t>
+      </w:r>
+    </w:p>
+    <w:p>
+      <w:pPr>
+        <w:rPr>
+          <w:rFonts w:ascii="Arial" w:hAnsi="Arial" w:cs="Arial"/>
+          <w:sz w:val="32"/>
+          <w:szCs w:val="32"/>
+        </w:rPr>
+      </w:pPr>
+      <w:r>
+        <w:rPr>
+          <w:rFonts w:ascii="Arial" w:hAnsi="Arial" w:cs="Arial"/>
+          <w:sz w:val="32"/>
+          <w:szCs w:val="32"/>
+        </w:rPr>
+        <w:t>They believe Fallen City must be rebuilt through force. Civilians are treated as assets to control, not people to protect. Rust’s soldiers are conditioned to see rebels — including Zed — as threats to the “greater good.”</w:t>
+      </w:r>
     </w:p>
     <w:p>
       <w:pPr>
@@ -6522,6 +7160,633 @@
       <w:pPr>
         <w:rPr>
           <w:rFonts w:ascii="Arial" w:hAnsi="Arial" w:cs="Arial"/>
+          <w:b/>
+          <w:bCs/>
+          <w:sz w:val="32"/>
+          <w:szCs w:val="32"/>
+        </w:rPr>
+      </w:pPr>
+      <w:r>
+        <w:rPr>
+          <w:rFonts w:ascii="Arial" w:hAnsi="Arial" w:cs="Arial"/>
+          <w:b/>
+          <w:bCs/>
+          <w:sz w:val="32"/>
+          <w:szCs w:val="32"/>
+        </w:rPr>
+        <w:t>Rust Unit Types</w:t>
+      </w:r>
+      <w:r>
+        <w:rPr>
+          <w:rFonts w:ascii="Arial" w:hAnsi="Arial" w:cs="Arial"/>
+          <w:b/>
+          <w:bCs/>
+          <w:sz w:val="32"/>
+          <w:szCs w:val="32"/>
+        </w:rPr>
+        <w:t xml:space="preserve"> Enemies </w:t>
+      </w:r>
+    </w:p>
+    <w:p>
+      <w:pPr>
+        <w:rPr>
+          <w:rFonts w:ascii="Arial" w:hAnsi="Arial" w:cs="Arial"/>
+          <w:b/>
+          <w:bCs/>
+          <w:sz w:val="32"/>
+          <w:szCs w:val="32"/>
+        </w:rPr>
+      </w:pPr>
+    </w:p>
+    <w:p>
+      <w:pPr>
+        <w:rPr>
+          <w:rFonts w:ascii="Arial" w:hAnsi="Arial" w:cs="Arial"/>
+          <w:b/>
+          <w:bCs/>
+          <w:sz w:val="32"/>
+          <w:szCs w:val="32"/>
+        </w:rPr>
+      </w:pPr>
+    </w:p>
+    <w:p>
+      <w:pPr>
+        <w:rPr>
+          <w:rFonts w:ascii="Arial" w:hAnsi="Arial" w:cs="Arial"/>
+          <w:b/>
+          <w:bCs/>
+          <w:sz w:val="32"/>
+          <w:szCs w:val="32"/>
+        </w:rPr>
+      </w:pPr>
+      <w:r>
+        <w:rPr>
+          <w:rFonts w:ascii="Arial" w:hAnsi="Arial" w:cs="Arial"/>
+          <w:b/>
+          <w:bCs/>
+          <w:sz w:val="32"/>
+          <w:szCs w:val="32"/>
+        </w:rPr>
+        <w:t>1. Rust Grunts — “The Iron Line”</w:t>
+      </w:r>
+    </w:p>
+    <w:p>
+      <w:pPr>
+        <w:rPr>
+          <w:rFonts w:ascii="Arial" w:hAnsi="Arial" w:cs="Arial"/>
+          <w:b/>
+          <w:bCs/>
+          <w:sz w:val="32"/>
+          <w:szCs w:val="32"/>
+        </w:rPr>
+      </w:pPr>
+      <w:r>
+        <w:rPr>
+          <w:rFonts w:ascii="Arial" w:hAnsi="Arial" w:cs="Arial"/>
+          <w:b/>
+          <w:bCs/>
+          <w:sz w:val="32"/>
+          <w:szCs w:val="32"/>
+        </w:rPr>
+        <w:t xml:space="preserve">The backbone of Rust’s force. Once ordinary citizens, they were coerced or manipulated into service. Their </w:t>
+      </w:r>
+      <w:proofErr w:type="spellStart"/>
+      <w:r>
+        <w:rPr>
+          <w:rFonts w:ascii="Arial" w:hAnsi="Arial" w:cs="Arial"/>
+          <w:b/>
+          <w:bCs/>
+          <w:sz w:val="32"/>
+          <w:szCs w:val="32"/>
+        </w:rPr>
+        <w:t>armor</w:t>
+      </w:r>
+      <w:proofErr w:type="spellEnd"/>
+      <w:r>
+        <w:rPr>
+          <w:rFonts w:ascii="Arial" w:hAnsi="Arial" w:cs="Arial"/>
+          <w:b/>
+          <w:bCs/>
+          <w:sz w:val="32"/>
+          <w:szCs w:val="32"/>
+        </w:rPr>
+        <w:t xml:space="preserve"> is cheap, rust</w:t>
+      </w:r>
+      <w:r>
+        <w:rPr>
+          <w:rFonts w:ascii="Arial" w:hAnsi="Arial" w:cs="Arial"/>
+          <w:b/>
+          <w:bCs/>
+          <w:sz w:val="32"/>
+          <w:szCs w:val="32"/>
+        </w:rPr>
+        <w:noBreakHyphen/>
+        <w:t>coated plating, and their helmets hide their identities — intentionally.</w:t>
+      </w:r>
+    </w:p>
+    <w:p>
+      <w:pPr>
+        <w:rPr>
+          <w:rFonts w:ascii="Arial" w:hAnsi="Arial" w:cs="Arial"/>
+          <w:b/>
+          <w:bCs/>
+          <w:sz w:val="32"/>
+          <w:szCs w:val="32"/>
+        </w:rPr>
+      </w:pPr>
+      <w:r>
+        <w:rPr>
+          <w:rFonts w:ascii="Arial" w:hAnsi="Arial" w:cs="Arial"/>
+          <w:b/>
+          <w:bCs/>
+          <w:sz w:val="32"/>
+          <w:szCs w:val="32"/>
+        </w:rPr>
+        <w:t xml:space="preserve">Lore: Rust strips </w:t>
+      </w:r>
+      <w:r>
+        <w:rPr>
+          <w:rFonts w:ascii="Arial" w:hAnsi="Arial" w:cs="Arial"/>
+          <w:b/>
+          <w:bCs/>
+          <w:sz w:val="32"/>
+          <w:szCs w:val="32"/>
+        </w:rPr>
+        <w:t>recruit</w:t>
+      </w:r>
+      <w:r>
+        <w:rPr>
+          <w:rFonts w:ascii="Arial" w:hAnsi="Arial" w:cs="Arial"/>
+          <w:b/>
+          <w:bCs/>
+          <w:sz w:val="32"/>
+          <w:szCs w:val="32"/>
+        </w:rPr>
+        <w:t xml:space="preserve"> of their names, replacing them with serial numbers. This erases individuality and ensures obedience.</w:t>
+      </w:r>
+    </w:p>
+    <w:p>
+      <w:pPr>
+        <w:rPr>
+          <w:rFonts w:ascii="Arial" w:hAnsi="Arial" w:cs="Arial"/>
+          <w:b/>
+          <w:bCs/>
+          <w:sz w:val="32"/>
+          <w:szCs w:val="32"/>
+        </w:rPr>
+      </w:pPr>
+      <w:r>
+        <w:rPr>
+          <w:rFonts w:ascii="Arial" w:hAnsi="Arial" w:cs="Arial"/>
+          <w:b/>
+          <w:bCs/>
+          <w:sz w:val="32"/>
+          <w:szCs w:val="32"/>
+        </w:rPr>
+        <w:t>Purpose: Crowd control, intimidation, frontline combat.</w:t>
+      </w:r>
+    </w:p>
+    <w:p>
+      <w:pPr>
+        <w:rPr>
+          <w:rFonts w:ascii="Arial" w:hAnsi="Arial" w:cs="Arial"/>
+          <w:b/>
+          <w:bCs/>
+          <w:sz w:val="32"/>
+          <w:szCs w:val="32"/>
+        </w:rPr>
+      </w:pPr>
+      <w:r>
+        <w:rPr>
+          <w:rFonts w:ascii="Arial" w:hAnsi="Arial" w:cs="Arial"/>
+          <w:b/>
+          <w:bCs/>
+          <w:sz w:val="32"/>
+          <w:szCs w:val="32"/>
+        </w:rPr>
+        <w:t>2. Rust Bruisers — “The Breakers”</w:t>
+      </w:r>
+    </w:p>
+    <w:p>
+      <w:pPr>
+        <w:rPr>
+          <w:rFonts w:ascii="Arial" w:hAnsi="Arial" w:cs="Arial"/>
+          <w:b/>
+          <w:bCs/>
+          <w:sz w:val="32"/>
+          <w:szCs w:val="32"/>
+        </w:rPr>
+      </w:pPr>
+      <w:r>
+        <w:rPr>
+          <w:rFonts w:ascii="Arial" w:hAnsi="Arial" w:cs="Arial"/>
+          <w:b/>
+          <w:bCs/>
+          <w:sz w:val="32"/>
+          <w:szCs w:val="32"/>
+        </w:rPr>
+        <w:t xml:space="preserve">Massive enforcers enhanced with illegal muscle stimulants. Their </w:t>
+      </w:r>
+      <w:proofErr w:type="spellStart"/>
+      <w:r>
+        <w:rPr>
+          <w:rFonts w:ascii="Arial" w:hAnsi="Arial" w:cs="Arial"/>
+          <w:b/>
+          <w:bCs/>
+          <w:sz w:val="32"/>
+          <w:szCs w:val="32"/>
+        </w:rPr>
+        <w:t>armor</w:t>
+      </w:r>
+      <w:proofErr w:type="spellEnd"/>
+      <w:r>
+        <w:rPr>
+          <w:rFonts w:ascii="Arial" w:hAnsi="Arial" w:cs="Arial"/>
+          <w:b/>
+          <w:bCs/>
+          <w:sz w:val="32"/>
+          <w:szCs w:val="32"/>
+        </w:rPr>
+        <w:t xml:space="preserve"> is reinforced with heavy plating, giving them a hulking silhouette.</w:t>
+      </w:r>
+    </w:p>
+    <w:p>
+      <w:pPr>
+        <w:rPr>
+          <w:rFonts w:ascii="Arial" w:hAnsi="Arial" w:cs="Arial"/>
+          <w:b/>
+          <w:bCs/>
+          <w:sz w:val="32"/>
+          <w:szCs w:val="32"/>
+        </w:rPr>
+      </w:pPr>
+      <w:r>
+        <w:rPr>
+          <w:rFonts w:ascii="Arial" w:hAnsi="Arial" w:cs="Arial"/>
+          <w:b/>
+          <w:bCs/>
+          <w:sz w:val="32"/>
+          <w:szCs w:val="32"/>
+        </w:rPr>
+        <w:t>Lore: Breakers are often former criminals promised freedom in exchange for loyalty. Rust chemically augments them, making them stronger but unstable.</w:t>
+      </w:r>
+    </w:p>
+    <w:p>
+      <w:pPr>
+        <w:rPr>
+          <w:rFonts w:ascii="Arial" w:hAnsi="Arial" w:cs="Arial"/>
+          <w:b/>
+          <w:bCs/>
+          <w:sz w:val="32"/>
+          <w:szCs w:val="32"/>
+        </w:rPr>
+      </w:pPr>
+      <w:r>
+        <w:rPr>
+          <w:rFonts w:ascii="Arial" w:hAnsi="Arial" w:cs="Arial"/>
+          <w:b/>
+          <w:bCs/>
+          <w:sz w:val="32"/>
+          <w:szCs w:val="32"/>
+        </w:rPr>
+        <w:t>Purpose: Shock troops, area denial, crushing resistance groups.</w:t>
+      </w:r>
+    </w:p>
+    <w:p>
+      <w:pPr>
+        <w:rPr>
+          <w:rFonts w:ascii="Arial" w:hAnsi="Arial" w:cs="Arial"/>
+          <w:b/>
+          <w:bCs/>
+          <w:sz w:val="32"/>
+          <w:szCs w:val="32"/>
+        </w:rPr>
+      </w:pPr>
+      <w:r>
+        <w:rPr>
+          <w:rFonts w:ascii="Arial" w:hAnsi="Arial" w:cs="Arial"/>
+          <w:b/>
+          <w:bCs/>
+          <w:sz w:val="32"/>
+          <w:szCs w:val="32"/>
+        </w:rPr>
+        <w:t>3. Rust Rangers — “The Watchers”</w:t>
+      </w:r>
+    </w:p>
+    <w:p>
+      <w:pPr>
+        <w:rPr>
+          <w:rFonts w:ascii="Arial" w:hAnsi="Arial" w:cs="Arial"/>
+          <w:b/>
+          <w:bCs/>
+          <w:sz w:val="32"/>
+          <w:szCs w:val="32"/>
+        </w:rPr>
+      </w:pPr>
+      <w:r>
+        <w:rPr>
+          <w:rFonts w:ascii="Arial" w:hAnsi="Arial" w:cs="Arial"/>
+          <w:b/>
+          <w:bCs/>
+          <w:sz w:val="32"/>
+          <w:szCs w:val="32"/>
+        </w:rPr>
+        <w:t>Agile units equipped with taser rifles, batons, and tracking visors.</w:t>
+      </w:r>
+    </w:p>
+    <w:p>
+      <w:pPr>
+        <w:rPr>
+          <w:rFonts w:ascii="Arial" w:hAnsi="Arial" w:cs="Arial"/>
+          <w:b/>
+          <w:bCs/>
+          <w:sz w:val="32"/>
+          <w:szCs w:val="32"/>
+        </w:rPr>
+      </w:pPr>
+      <w:r>
+        <w:rPr>
+          <w:rFonts w:ascii="Arial" w:hAnsi="Arial" w:cs="Arial"/>
+          <w:b/>
+          <w:bCs/>
+          <w:sz w:val="32"/>
+          <w:szCs w:val="32"/>
+        </w:rPr>
+        <w:lastRenderedPageBreak/>
+        <w:t>Lore: Watchers are trained to hunt rebels through the city’s alleyways and rooftops. Their visors can scan heat signatures, making hiding nearly impossible.</w:t>
+      </w:r>
+    </w:p>
+    <w:p>
+      <w:pPr>
+        <w:rPr>
+          <w:rFonts w:ascii="Arial" w:hAnsi="Arial" w:cs="Arial"/>
+          <w:b/>
+          <w:bCs/>
+          <w:sz w:val="32"/>
+          <w:szCs w:val="32"/>
+        </w:rPr>
+      </w:pPr>
+      <w:r>
+        <w:rPr>
+          <w:rFonts w:ascii="Arial" w:hAnsi="Arial" w:cs="Arial"/>
+          <w:b/>
+          <w:bCs/>
+          <w:sz w:val="32"/>
+          <w:szCs w:val="32"/>
+        </w:rPr>
+        <w:t>Purpose: Long</w:t>
+      </w:r>
+      <w:r>
+        <w:rPr>
+          <w:rFonts w:ascii="Arial" w:hAnsi="Arial" w:cs="Arial"/>
+          <w:b/>
+          <w:bCs/>
+          <w:sz w:val="32"/>
+          <w:szCs w:val="32"/>
+        </w:rPr>
+        <w:noBreakHyphen/>
+        <w:t>range harassment, pursuit, reconnaissance.</w:t>
+      </w:r>
+    </w:p>
+    <w:p>
+      <w:pPr>
+        <w:rPr>
+          <w:rFonts w:ascii="Arial" w:hAnsi="Arial" w:cs="Arial"/>
+          <w:b/>
+          <w:bCs/>
+          <w:sz w:val="32"/>
+          <w:szCs w:val="32"/>
+        </w:rPr>
+      </w:pPr>
+      <w:r>
+        <w:rPr>
+          <w:rFonts w:ascii="Arial" w:hAnsi="Arial" w:cs="Arial"/>
+          <w:b/>
+          <w:bCs/>
+          <w:sz w:val="32"/>
+          <w:szCs w:val="32"/>
+        </w:rPr>
+        <w:t>4. Rust Specialists — “The Copper Fangs”</w:t>
+      </w:r>
+    </w:p>
+    <w:p>
+      <w:pPr>
+        <w:rPr>
+          <w:rFonts w:ascii="Arial" w:hAnsi="Arial" w:cs="Arial"/>
+          <w:b/>
+          <w:bCs/>
+          <w:sz w:val="32"/>
+          <w:szCs w:val="32"/>
+        </w:rPr>
+      </w:pPr>
+      <w:r>
+        <w:rPr>
+          <w:rFonts w:ascii="Arial" w:hAnsi="Arial" w:cs="Arial"/>
+          <w:b/>
+          <w:bCs/>
+          <w:sz w:val="32"/>
+          <w:szCs w:val="32"/>
+        </w:rPr>
+        <w:t>Elite soldiers with advanced gear: electrified gauntlets, grappling hooks, and tactical shields.</w:t>
+      </w:r>
+    </w:p>
+    <w:p>
+      <w:pPr>
+        <w:rPr>
+          <w:rFonts w:ascii="Arial" w:hAnsi="Arial" w:cs="Arial"/>
+          <w:b/>
+          <w:bCs/>
+          <w:sz w:val="32"/>
+          <w:szCs w:val="32"/>
+        </w:rPr>
+      </w:pPr>
+      <w:r>
+        <w:rPr>
+          <w:rFonts w:ascii="Arial" w:hAnsi="Arial" w:cs="Arial"/>
+          <w:b/>
+          <w:bCs/>
+          <w:sz w:val="32"/>
+          <w:szCs w:val="32"/>
+        </w:rPr>
+        <w:t xml:space="preserve">Lore: Chosen from the most loyal Rust members, Fangs undergo psychological conditioning to remove fear and hesitation. They are Varr’s personal </w:t>
+      </w:r>
+      <w:proofErr w:type="spellStart"/>
+      <w:r>
+        <w:rPr>
+          <w:rFonts w:ascii="Arial" w:hAnsi="Arial" w:cs="Arial"/>
+          <w:b/>
+          <w:bCs/>
+          <w:sz w:val="32"/>
+          <w:szCs w:val="32"/>
+        </w:rPr>
+        <w:t>favorites</w:t>
+      </w:r>
+      <w:proofErr w:type="spellEnd"/>
+      <w:r>
+        <w:rPr>
+          <w:rFonts w:ascii="Arial" w:hAnsi="Arial" w:cs="Arial"/>
+          <w:b/>
+          <w:bCs/>
+          <w:sz w:val="32"/>
+          <w:szCs w:val="32"/>
+        </w:rPr>
+        <w:t>.</w:t>
+      </w:r>
+    </w:p>
+    <w:p>
+      <w:pPr>
+        <w:rPr>
+          <w:rFonts w:ascii="Arial" w:hAnsi="Arial" w:cs="Arial"/>
+          <w:b/>
+          <w:bCs/>
+          <w:sz w:val="32"/>
+          <w:szCs w:val="32"/>
+        </w:rPr>
+      </w:pPr>
+      <w:r>
+        <w:rPr>
+          <w:rFonts w:ascii="Arial" w:hAnsi="Arial" w:cs="Arial"/>
+          <w:b/>
+          <w:bCs/>
+          <w:sz w:val="32"/>
+          <w:szCs w:val="32"/>
+        </w:rPr>
+        <w:t>Purpose: High</w:t>
+      </w:r>
+      <w:r>
+        <w:rPr>
+          <w:rFonts w:ascii="Arial" w:hAnsi="Arial" w:cs="Arial"/>
+          <w:b/>
+          <w:bCs/>
+          <w:sz w:val="32"/>
+          <w:szCs w:val="32"/>
+        </w:rPr>
+        <w:noBreakHyphen/>
+        <w:t>priority target elimination, boss</w:t>
+      </w:r>
+      <w:r>
+        <w:rPr>
+          <w:rFonts w:ascii="Arial" w:hAnsi="Arial" w:cs="Arial"/>
+          <w:b/>
+          <w:bCs/>
+          <w:sz w:val="32"/>
+          <w:szCs w:val="32"/>
+        </w:rPr>
+        <w:noBreakHyphen/>
+        <w:t>tier encounters.</w:t>
+      </w:r>
+    </w:p>
+    <w:p>
+      <w:pPr>
+        <w:rPr>
+          <w:rFonts w:ascii="Arial" w:hAnsi="Arial" w:cs="Arial"/>
+          <w:b/>
+          <w:bCs/>
+          <w:sz w:val="32"/>
+          <w:szCs w:val="32"/>
+        </w:rPr>
+      </w:pPr>
+      <w:r>
+        <w:rPr>
+          <w:rFonts w:ascii="Arial" w:hAnsi="Arial" w:cs="Arial"/>
+          <w:b/>
+          <w:bCs/>
+          <w:sz w:val="32"/>
+          <w:szCs w:val="32"/>
+        </w:rPr>
+        <w:t>5. Rust Overseers — “The Architects of Control”</w:t>
+      </w:r>
+    </w:p>
+    <w:p>
+      <w:pPr>
+        <w:rPr>
+          <w:rFonts w:ascii="Arial" w:hAnsi="Arial" w:cs="Arial"/>
+          <w:b/>
+          <w:bCs/>
+          <w:sz w:val="32"/>
+          <w:szCs w:val="32"/>
+        </w:rPr>
+      </w:pPr>
+      <w:r>
+        <w:rPr>
+          <w:rFonts w:ascii="Arial" w:hAnsi="Arial" w:cs="Arial"/>
+          <w:b/>
+          <w:bCs/>
+          <w:sz w:val="32"/>
+          <w:szCs w:val="32"/>
+        </w:rPr>
+        <w:t>Commanders who manage entire districts. They rarely fight directly but deploy drones, turrets, and squads with ruthless precision.</w:t>
+      </w:r>
+    </w:p>
+    <w:p>
+      <w:pPr>
+        <w:rPr>
+          <w:rFonts w:ascii="Arial" w:hAnsi="Arial" w:cs="Arial"/>
+          <w:b/>
+          <w:bCs/>
+          <w:sz w:val="32"/>
+          <w:szCs w:val="32"/>
+        </w:rPr>
+      </w:pPr>
+      <w:r>
+        <w:rPr>
+          <w:rFonts w:ascii="Arial" w:hAnsi="Arial" w:cs="Arial"/>
+          <w:b/>
+          <w:bCs/>
+          <w:sz w:val="32"/>
+          <w:szCs w:val="32"/>
+        </w:rPr>
+        <w:t>Lore: Overseers are former politicians and corporate leaders who sided with Rust during the takeover. They maintain control through surveillance networks and propaganda.</w:t>
+      </w:r>
+    </w:p>
+    <w:p>
+      <w:pPr>
+        <w:rPr>
+          <w:rFonts w:ascii="Arial" w:hAnsi="Arial" w:cs="Arial"/>
+          <w:b/>
+          <w:bCs/>
+          <w:sz w:val="32"/>
+          <w:szCs w:val="32"/>
+        </w:rPr>
+      </w:pPr>
+      <w:r>
+        <w:rPr>
+          <w:rFonts w:ascii="Arial" w:hAnsi="Arial" w:cs="Arial"/>
+          <w:b/>
+          <w:bCs/>
+          <w:sz w:val="32"/>
+          <w:szCs w:val="32"/>
+        </w:rPr>
+        <w:t xml:space="preserve">Purpose: </w:t>
+      </w:r>
+      <w:r>
+        <w:rPr>
+          <w:rFonts w:ascii="Arial" w:hAnsi="Arial" w:cs="Arial"/>
+          <w:b/>
+          <w:bCs/>
+          <w:sz w:val="32"/>
+          <w:szCs w:val="32"/>
+        </w:rPr>
+        <w:t>end level</w:t>
+      </w:r>
+      <w:r>
+        <w:rPr>
+          <w:rFonts w:ascii="Arial" w:hAnsi="Arial" w:cs="Arial"/>
+          <w:b/>
+          <w:bCs/>
+          <w:sz w:val="32"/>
+          <w:szCs w:val="32"/>
+        </w:rPr>
+        <w:noBreakHyphen/>
+        <w:t>bosses, district rulers, story antagonists.</w:t>
+      </w:r>
+    </w:p>
+    <w:p>
+      <w:pPr>
+        <w:rPr>
+          <w:rFonts w:ascii="Arial" w:hAnsi="Arial" w:cs="Arial"/>
+          <w:b/>
+          <w:bCs/>
           <w:sz w:val="32"/>
           <w:szCs w:val="32"/>
         </w:rPr>
@@ -6540,9 +7805,9 @@
 <file path=word/numbering.xml><?xml version="1.0" encoding="utf-8"?>
 <w:numbering xmlns:wpc="http://schemas.microsoft.com/office/word/2010/wordprocessingCanvas" xmlns:cx="http://schemas.microsoft.com/office/drawing/2014/chartex" xmlns:cx1="http://schemas.microsoft.com/office/drawing/2015/9/8/chartex" xmlns:cx2="http://schemas.microsoft.com/office/drawing/2015/10/21/chartex" xmlns:cx3="http://schemas.microsoft.com/office/drawing/2016/5/9/chartex" xmlns:cx4="http://schemas.microsoft.com/office/drawing/2016/5/10/chartex" xmlns:cx5="http://schemas.microsoft.com/office/drawing/2016/5/11/chartex" xmlns:cx6="http://schemas.microsoft.com/office/drawing/2016/5/12/chartex" xmlns:cx7="http://schemas.microsoft.com/office/drawing/2016/5/13/chartex" xmlns:cx8="http://schemas.microsoft.com/office/drawing/2016/5/14/chartex" xmlns:mc="http://schemas.openxmlformats.org/markup-compatibility/2006" xmlns:aink="http://schemas.microsoft.com/office/drawing/2016/ink" xmlns:am3d="http://schemas.microsoft.com/office/drawing/2017/model3d" xmlns:o="urn:schemas-microsoft-com:office:office" xmlns:oel="http://schemas.microsoft.com/office/2019/extlst" xmlns:r="http://schemas.openxmlformats.org/officeDocument/2006/relationships" xmlns:m="http://schemas.openxmlformats.org/officeDocument/2006/math" xmlns:v="urn:schemas-microsoft-com:vml" xmlns:wp14="http://schemas.microsoft.com/office/word/2010/wordprocessingDrawing" xmlns:wp="http://schemas.openxmlformats.org/drawingml/2006/wordprocessingDrawing" xmlns:w10="urn:schemas-microsoft-com:office:word" xmlns:w="http://schemas.openxmlformats.org/wordprocessingml/2006/main" xmlns:w14="http://schemas.microsoft.com/office/word/2010/wordml" xmlns:w15="http://schemas.microsoft.com/office/word/2012/wordml" xmlns:w16cex="http://schemas.microsoft.com/office/word/2018/wordml/cex" xmlns:w16cid="http://schemas.microsoft.com/office/word/2016/wordml/cid" xmlns:w16="http://schemas.microsoft.com/office/word/2018/wordml" xmlns:w16du="http://schemas.microsoft.com/office/word/2023/wordml/word16du" xmlns:w16sdtdh="http://schemas.microsoft.com/office/word/2020/wordml/sdtdatahash" xmlns:w16sdtfl="http://schemas.microsoft.com/office/word/2024/wordml/sdtformatlock" xmlns:w16se="http://schemas.microsoft.com/office/word/2015/wordml/symex" xmlns:wpg="http://schemas.microsoft.com/office/word/2010/wordprocessingGroup" xmlns:wpi="http://schemas.microsoft.com/office/word/2010/wordprocessingInk" xmlns:wne="http://schemas.microsoft.com/office/word/2006/wordml" xmlns:wps="http://schemas.microsoft.com/office/word/2010/wordprocessingShape" mc:Ignorable="w14 w15 w16se w16cid w16 w16cex w16sdtdh w16sdtfl w16du wp14">
   <w:abstractNum w:abstractNumId="0" w15:restartNumberingAfterBreak="0">
-    <w:nsid w:val="11E7720F"/>
+    <w:nsid w:val="0FF4426A"/>
     <w:multiLevelType w:val="multilevel"/>
-    <w:tmpl w:val="CDB8BD90"/>
+    <w:tmpl w:val="3398BB92"/>
     <w:lvl w:ilvl="0">
       <w:start w:val="1"/>
       <w:numFmt w:val="bullet"/>
@@ -6689,9 +7954,9 @@
     </w:lvl>
   </w:abstractNum>
   <w:abstractNum w:abstractNumId="1" w15:restartNumberingAfterBreak="0">
-    <w:nsid w:val="1DCA74C9"/>
+    <w:nsid w:val="11E7720F"/>
     <w:multiLevelType w:val="multilevel"/>
-    <w:tmpl w:val="0A106D4A"/>
+    <w:tmpl w:val="CDB8BD90"/>
     <w:lvl w:ilvl="0">
       <w:start w:val="1"/>
       <w:numFmt w:val="bullet"/>
@@ -6838,122 +8103,9 @@
     </w:lvl>
   </w:abstractNum>
   <w:abstractNum w:abstractNumId="2" w15:restartNumberingAfterBreak="0">
-    <w:nsid w:val="3EB42FB1"/>
-    <w:multiLevelType w:val="hybridMultilevel"/>
-    <w:tmpl w:val="116815E0"/>
-    <w:lvl w:ilvl="0" w:tplc="08090001">
-      <w:start w:val="1"/>
-      <w:numFmt w:val="bullet"/>
-      <w:lvlText w:val=""/>
-      <w:lvlJc w:val="left"/>
-      <w:pPr>
-        <w:ind w:left="720" w:hanging="360"/>
-      </w:pPr>
-      <w:rPr>
-        <w:rFonts w:ascii="Symbol" w:hAnsi="Symbol" w:hint="default"/>
-      </w:rPr>
-    </w:lvl>
-    <w:lvl w:ilvl="1" w:tplc="08090003" w:tentative="1">
-      <w:start w:val="1"/>
-      <w:numFmt w:val="bullet"/>
-      <w:lvlText w:val="o"/>
-      <w:lvlJc w:val="left"/>
-      <w:pPr>
-        <w:ind w:left="1440" w:hanging="360"/>
-      </w:pPr>
-      <w:rPr>
-        <w:rFonts w:ascii="Courier New" w:hAnsi="Courier New" w:cs="Courier New" w:hint="default"/>
-      </w:rPr>
-    </w:lvl>
-    <w:lvl w:ilvl="2" w:tplc="08090005" w:tentative="1">
-      <w:start w:val="1"/>
-      <w:numFmt w:val="bullet"/>
-      <w:lvlText w:val=""/>
-      <w:lvlJc w:val="left"/>
-      <w:pPr>
-        <w:ind w:left="2160" w:hanging="360"/>
-      </w:pPr>
-      <w:rPr>
-        <w:rFonts w:ascii="Wingdings" w:hAnsi="Wingdings" w:hint="default"/>
-      </w:rPr>
-    </w:lvl>
-    <w:lvl w:ilvl="3" w:tplc="08090001" w:tentative="1">
-      <w:start w:val="1"/>
-      <w:numFmt w:val="bullet"/>
-      <w:lvlText w:val=""/>
-      <w:lvlJc w:val="left"/>
-      <w:pPr>
-        <w:ind w:left="2880" w:hanging="360"/>
-      </w:pPr>
-      <w:rPr>
-        <w:rFonts w:ascii="Symbol" w:hAnsi="Symbol" w:hint="default"/>
-      </w:rPr>
-    </w:lvl>
-    <w:lvl w:ilvl="4" w:tplc="08090003" w:tentative="1">
-      <w:start w:val="1"/>
-      <w:numFmt w:val="bullet"/>
-      <w:lvlText w:val="o"/>
-      <w:lvlJc w:val="left"/>
-      <w:pPr>
-        <w:ind w:left="3600" w:hanging="360"/>
-      </w:pPr>
-      <w:rPr>
-        <w:rFonts w:ascii="Courier New" w:hAnsi="Courier New" w:cs="Courier New" w:hint="default"/>
-      </w:rPr>
-    </w:lvl>
-    <w:lvl w:ilvl="5" w:tplc="08090005" w:tentative="1">
-      <w:start w:val="1"/>
-      <w:numFmt w:val="bullet"/>
-      <w:lvlText w:val=""/>
-      <w:lvlJc w:val="left"/>
-      <w:pPr>
-        <w:ind w:left="4320" w:hanging="360"/>
-      </w:pPr>
-      <w:rPr>
-        <w:rFonts w:ascii="Wingdings" w:hAnsi="Wingdings" w:hint="default"/>
-      </w:rPr>
-    </w:lvl>
-    <w:lvl w:ilvl="6" w:tplc="08090001" w:tentative="1">
-      <w:start w:val="1"/>
-      <w:numFmt w:val="bullet"/>
-      <w:lvlText w:val=""/>
-      <w:lvlJc w:val="left"/>
-      <w:pPr>
-        <w:ind w:left="5040" w:hanging="360"/>
-      </w:pPr>
-      <w:rPr>
-        <w:rFonts w:ascii="Symbol" w:hAnsi="Symbol" w:hint="default"/>
-      </w:rPr>
-    </w:lvl>
-    <w:lvl w:ilvl="7" w:tplc="08090003" w:tentative="1">
-      <w:start w:val="1"/>
-      <w:numFmt w:val="bullet"/>
-      <w:lvlText w:val="o"/>
-      <w:lvlJc w:val="left"/>
-      <w:pPr>
-        <w:ind w:left="5760" w:hanging="360"/>
-      </w:pPr>
-      <w:rPr>
-        <w:rFonts w:ascii="Courier New" w:hAnsi="Courier New" w:cs="Courier New" w:hint="default"/>
-      </w:rPr>
-    </w:lvl>
-    <w:lvl w:ilvl="8" w:tplc="08090005" w:tentative="1">
-      <w:start w:val="1"/>
-      <w:numFmt w:val="bullet"/>
-      <w:lvlText w:val=""/>
-      <w:lvlJc w:val="left"/>
-      <w:pPr>
-        <w:ind w:left="6480" w:hanging="360"/>
-      </w:pPr>
-      <w:rPr>
-        <w:rFonts w:ascii="Wingdings" w:hAnsi="Wingdings" w:hint="default"/>
-      </w:rPr>
-    </w:lvl>
-  </w:abstractNum>
-  <w:abstractNum w:abstractNumId="3" w15:restartNumberingAfterBreak="0">
-    <w:nsid w:val="6A476A03"/>
+    <w:nsid w:val="1DCA74C9"/>
     <w:multiLevelType w:val="multilevel"/>
-    <w:tmpl w:val="A4BC68FA"/>
+    <w:tmpl w:val="0A106D4A"/>
     <w:lvl w:ilvl="0">
       <w:start w:val="1"/>
       <w:numFmt w:val="bullet"/>
@@ -7099,17 +8251,282 @@
       </w:rPr>
     </w:lvl>
   </w:abstractNum>
+  <w:abstractNum w:abstractNumId="3" w15:restartNumberingAfterBreak="0">
+    <w:nsid w:val="3EB42FB1"/>
+    <w:multiLevelType w:val="hybridMultilevel"/>
+    <w:tmpl w:val="116815E0"/>
+    <w:lvl w:ilvl="0" w:tplc="08090001">
+      <w:start w:val="1"/>
+      <w:numFmt w:val="bullet"/>
+      <w:lvlText w:val=""/>
+      <w:lvlJc w:val="left"/>
+      <w:pPr>
+        <w:ind w:left="720" w:hanging="360"/>
+      </w:pPr>
+      <w:rPr>
+        <w:rFonts w:ascii="Symbol" w:hAnsi="Symbol" w:hint="default"/>
+      </w:rPr>
+    </w:lvl>
+    <w:lvl w:ilvl="1" w:tplc="08090003" w:tentative="1">
+      <w:start w:val="1"/>
+      <w:numFmt w:val="bullet"/>
+      <w:lvlText w:val="o"/>
+      <w:lvlJc w:val="left"/>
+      <w:pPr>
+        <w:ind w:left="1440" w:hanging="360"/>
+      </w:pPr>
+      <w:rPr>
+        <w:rFonts w:ascii="Courier New" w:hAnsi="Courier New" w:cs="Courier New" w:hint="default"/>
+      </w:rPr>
+    </w:lvl>
+    <w:lvl w:ilvl="2" w:tplc="08090005" w:tentative="1">
+      <w:start w:val="1"/>
+      <w:numFmt w:val="bullet"/>
+      <w:lvlText w:val=""/>
+      <w:lvlJc w:val="left"/>
+      <w:pPr>
+        <w:ind w:left="2160" w:hanging="360"/>
+      </w:pPr>
+      <w:rPr>
+        <w:rFonts w:ascii="Wingdings" w:hAnsi="Wingdings" w:hint="default"/>
+      </w:rPr>
+    </w:lvl>
+    <w:lvl w:ilvl="3" w:tplc="08090001" w:tentative="1">
+      <w:start w:val="1"/>
+      <w:numFmt w:val="bullet"/>
+      <w:lvlText w:val=""/>
+      <w:lvlJc w:val="left"/>
+      <w:pPr>
+        <w:ind w:left="2880" w:hanging="360"/>
+      </w:pPr>
+      <w:rPr>
+        <w:rFonts w:ascii="Symbol" w:hAnsi="Symbol" w:hint="default"/>
+      </w:rPr>
+    </w:lvl>
+    <w:lvl w:ilvl="4" w:tplc="08090003" w:tentative="1">
+      <w:start w:val="1"/>
+      <w:numFmt w:val="bullet"/>
+      <w:lvlText w:val="o"/>
+      <w:lvlJc w:val="left"/>
+      <w:pPr>
+        <w:ind w:left="3600" w:hanging="360"/>
+      </w:pPr>
+      <w:rPr>
+        <w:rFonts w:ascii="Courier New" w:hAnsi="Courier New" w:cs="Courier New" w:hint="default"/>
+      </w:rPr>
+    </w:lvl>
+    <w:lvl w:ilvl="5" w:tplc="08090005" w:tentative="1">
+      <w:start w:val="1"/>
+      <w:numFmt w:val="bullet"/>
+      <w:lvlText w:val=""/>
+      <w:lvlJc w:val="left"/>
+      <w:pPr>
+        <w:ind w:left="4320" w:hanging="360"/>
+      </w:pPr>
+      <w:rPr>
+        <w:rFonts w:ascii="Wingdings" w:hAnsi="Wingdings" w:hint="default"/>
+      </w:rPr>
+    </w:lvl>
+    <w:lvl w:ilvl="6" w:tplc="08090001" w:tentative="1">
+      <w:start w:val="1"/>
+      <w:numFmt w:val="bullet"/>
+      <w:lvlText w:val=""/>
+      <w:lvlJc w:val="left"/>
+      <w:pPr>
+        <w:ind w:left="5040" w:hanging="360"/>
+      </w:pPr>
+      <w:rPr>
+        <w:rFonts w:ascii="Symbol" w:hAnsi="Symbol" w:hint="default"/>
+      </w:rPr>
+    </w:lvl>
+    <w:lvl w:ilvl="7" w:tplc="08090003" w:tentative="1">
+      <w:start w:val="1"/>
+      <w:numFmt w:val="bullet"/>
+      <w:lvlText w:val="o"/>
+      <w:lvlJc w:val="left"/>
+      <w:pPr>
+        <w:ind w:left="5760" w:hanging="360"/>
+      </w:pPr>
+      <w:rPr>
+        <w:rFonts w:ascii="Courier New" w:hAnsi="Courier New" w:cs="Courier New" w:hint="default"/>
+      </w:rPr>
+    </w:lvl>
+    <w:lvl w:ilvl="8" w:tplc="08090005" w:tentative="1">
+      <w:start w:val="1"/>
+      <w:numFmt w:val="bullet"/>
+      <w:lvlText w:val=""/>
+      <w:lvlJc w:val="left"/>
+      <w:pPr>
+        <w:ind w:left="6480" w:hanging="360"/>
+      </w:pPr>
+      <w:rPr>
+        <w:rFonts w:ascii="Wingdings" w:hAnsi="Wingdings" w:hint="default"/>
+      </w:rPr>
+    </w:lvl>
+  </w:abstractNum>
+  <w:abstractNum w:abstractNumId="4" w15:restartNumberingAfterBreak="0">
+    <w:nsid w:val="6A476A03"/>
+    <w:multiLevelType w:val="multilevel"/>
+    <w:tmpl w:val="A4BC68FA"/>
+    <w:lvl w:ilvl="0">
+      <w:start w:val="1"/>
+      <w:numFmt w:val="bullet"/>
+      <w:lvlText w:val=""/>
+      <w:lvlJc w:val="left"/>
+      <w:pPr>
+        <w:tabs>
+          <w:tab w:val="num" w:pos="720"/>
+        </w:tabs>
+        <w:ind w:left="720" w:hanging="360"/>
+      </w:pPr>
+      <w:rPr>
+        <w:rFonts w:ascii="Symbol" w:hAnsi="Symbol" w:hint="default"/>
+        <w:sz w:val="20"/>
+      </w:rPr>
+    </w:lvl>
+    <w:lvl w:ilvl="1" w:tentative="1">
+      <w:start w:val="1"/>
+      <w:numFmt w:val="bullet"/>
+      <w:lvlText w:val="o"/>
+      <w:lvlJc w:val="left"/>
+      <w:pPr>
+        <w:tabs>
+          <w:tab w:val="num" w:pos="1440"/>
+        </w:tabs>
+        <w:ind w:left="1440" w:hanging="360"/>
+      </w:pPr>
+      <w:rPr>
+        <w:rFonts w:ascii="Courier New" w:hAnsi="Courier New" w:hint="default"/>
+        <w:sz w:val="20"/>
+      </w:rPr>
+    </w:lvl>
+    <w:lvl w:ilvl="2" w:tentative="1">
+      <w:start w:val="1"/>
+      <w:numFmt w:val="bullet"/>
+      <w:lvlText w:val=""/>
+      <w:lvlJc w:val="left"/>
+      <w:pPr>
+        <w:tabs>
+          <w:tab w:val="num" w:pos="2160"/>
+        </w:tabs>
+        <w:ind w:left="2160" w:hanging="360"/>
+      </w:pPr>
+      <w:rPr>
+        <w:rFonts w:ascii="Wingdings" w:hAnsi="Wingdings" w:hint="default"/>
+        <w:sz w:val="20"/>
+      </w:rPr>
+    </w:lvl>
+    <w:lvl w:ilvl="3" w:tentative="1">
+      <w:start w:val="1"/>
+      <w:numFmt w:val="bullet"/>
+      <w:lvlText w:val=""/>
+      <w:lvlJc w:val="left"/>
+      <w:pPr>
+        <w:tabs>
+          <w:tab w:val="num" w:pos="2880"/>
+        </w:tabs>
+        <w:ind w:left="2880" w:hanging="360"/>
+      </w:pPr>
+      <w:rPr>
+        <w:rFonts w:ascii="Wingdings" w:hAnsi="Wingdings" w:hint="default"/>
+        <w:sz w:val="20"/>
+      </w:rPr>
+    </w:lvl>
+    <w:lvl w:ilvl="4" w:tentative="1">
+      <w:start w:val="1"/>
+      <w:numFmt w:val="bullet"/>
+      <w:lvlText w:val=""/>
+      <w:lvlJc w:val="left"/>
+      <w:pPr>
+        <w:tabs>
+          <w:tab w:val="num" w:pos="3600"/>
+        </w:tabs>
+        <w:ind w:left="3600" w:hanging="360"/>
+      </w:pPr>
+      <w:rPr>
+        <w:rFonts w:ascii="Wingdings" w:hAnsi="Wingdings" w:hint="default"/>
+        <w:sz w:val="20"/>
+      </w:rPr>
+    </w:lvl>
+    <w:lvl w:ilvl="5" w:tentative="1">
+      <w:start w:val="1"/>
+      <w:numFmt w:val="bullet"/>
+      <w:lvlText w:val=""/>
+      <w:lvlJc w:val="left"/>
+      <w:pPr>
+        <w:tabs>
+          <w:tab w:val="num" w:pos="4320"/>
+        </w:tabs>
+        <w:ind w:left="4320" w:hanging="360"/>
+      </w:pPr>
+      <w:rPr>
+        <w:rFonts w:ascii="Wingdings" w:hAnsi="Wingdings" w:hint="default"/>
+        <w:sz w:val="20"/>
+      </w:rPr>
+    </w:lvl>
+    <w:lvl w:ilvl="6" w:tentative="1">
+      <w:start w:val="1"/>
+      <w:numFmt w:val="bullet"/>
+      <w:lvlText w:val=""/>
+      <w:lvlJc w:val="left"/>
+      <w:pPr>
+        <w:tabs>
+          <w:tab w:val="num" w:pos="5040"/>
+        </w:tabs>
+        <w:ind w:left="5040" w:hanging="360"/>
+      </w:pPr>
+      <w:rPr>
+        <w:rFonts w:ascii="Wingdings" w:hAnsi="Wingdings" w:hint="default"/>
+        <w:sz w:val="20"/>
+      </w:rPr>
+    </w:lvl>
+    <w:lvl w:ilvl="7" w:tentative="1">
+      <w:start w:val="1"/>
+      <w:numFmt w:val="bullet"/>
+      <w:lvlText w:val=""/>
+      <w:lvlJc w:val="left"/>
+      <w:pPr>
+        <w:tabs>
+          <w:tab w:val="num" w:pos="5760"/>
+        </w:tabs>
+        <w:ind w:left="5760" w:hanging="360"/>
+      </w:pPr>
+      <w:rPr>
+        <w:rFonts w:ascii="Wingdings" w:hAnsi="Wingdings" w:hint="default"/>
+        <w:sz w:val="20"/>
+      </w:rPr>
+    </w:lvl>
+    <w:lvl w:ilvl="8" w:tentative="1">
+      <w:start w:val="1"/>
+      <w:numFmt w:val="bullet"/>
+      <w:lvlText w:val=""/>
+      <w:lvlJc w:val="left"/>
+      <w:pPr>
+        <w:tabs>
+          <w:tab w:val="num" w:pos="6480"/>
+        </w:tabs>
+        <w:ind w:left="6480" w:hanging="360"/>
+      </w:pPr>
+      <w:rPr>
+        <w:rFonts w:ascii="Wingdings" w:hAnsi="Wingdings" w:hint="default"/>
+        <w:sz w:val="20"/>
+      </w:rPr>
+    </w:lvl>
+  </w:abstractNum>
   <w:num w:numId="1" w16cid:durableId="817764558">
+    <w:abstractNumId w:val="3"/>
+  </w:num>
+  <w:num w:numId="2" w16cid:durableId="164974891">
     <w:abstractNumId w:val="2"/>
   </w:num>
-  <w:num w:numId="2" w16cid:durableId="164974891">
+  <w:num w:numId="3" w16cid:durableId="1677805245">
     <w:abstractNumId w:val="1"/>
   </w:num>
-  <w:num w:numId="3" w16cid:durableId="1677805245">
+  <w:num w:numId="4" w16cid:durableId="1470391690">
+    <w:abstractNumId w:val="4"/>
+  </w:num>
+  <w:num w:numId="5" w16cid:durableId="708535279">
     <w:abstractNumId w:val="0"/>
-  </w:num>
-  <w:num w:numId="4" w16cid:durableId="1470391690">
-    <w:abstractNumId w:val="3"/>
   </w:num>
 </w:numbering>
 </file>
@@ -7717,7 +9134,6 @@
   <w:style w:type="character" w:default="1" w:styleId="DefaultParagraphFont">
     <w:name w:val="Default Paragraph Font"/>
     <w:uiPriority w:val="1"/>
-    <w:semiHidden/>
     <w:unhideWhenUsed/>
   </w:style>
   <w:style w:type="table" w:default="1" w:styleId="TableNormal">

</xml_diff>